<commit_message>
fix: BAP alignment, BAST layout, BAST/BAKL pihak defaults
BAP.docx: restore user's spacing (double-tab) for No Sales Order
  and Nama Pelanggan rows to align with other fields in table

BAST.docx table 1: restructure Perangkat/Jumlah from 2 rows × 2 cols
  to 1 row × 4 cols (side-by-side, ke kanan bukan ke bawah)

templates.ts:
- BAST pihak pertama/kedua fields: default '............'
- BAKL pihak pertama/kedua fields: default '............'
  (fallback dots jika field tidak diisi)

Co-Authored-By: Claude Sonnet 4.6 <noreply@anthropic.com>
</commit_message>
<xml_diff>
--- a/templates/docx/BAP.docx
+++ b/templates/docx/BAP.docx
@@ -229,11 +229,13 @@
                 <w:szCs w:val="20"/>
                 <w:rtl w:val="0"/>
               </w:rPr>
-              <w:t>No Sales Order</w:t>
+              <w:t xml:space="preserve">No Sales Order         </w:t>
+              <w:tab/>
+              <w:t xml:space="preserve">         </w:t>
               <w:tab/>
               <w:t>: {noSalesOrder}</w:t>
               <w:br/>
-              <w:t>Nama Pelanggan</w:t>
+              <w:t xml:space="preserve">Nama Pelanggan                   </w:t>
               <w:tab/>
               <w:t>: {namaPelanggan}</w:t>
             </w:r>

</xml_diff>

<commit_message>
fix(BAP): hanging indent so long Nama Pelanggan wraps under value column
Master packed No Sales Order + Nama Pelanggan in one paragraph joined by
<w:br/>. Split at the br, then hanging indent (2880/2880) on the Nama
Pelanggan row so a long customer name folds under the value column instead
of the cell margin. Preserves run rPr so font stays Arial 10pt.

Co-Authored-By: Claude Opus 4.8 <noreply@anthropic.com>
</commit_message>
<xml_diff>
--- a/templates/docx/BAP.docx
+++ b/templates/docx/BAP.docx
@@ -234,7 +234,25 @@
               <w:t xml:space="preserve">         </w:t>
               <w:tab/>
               <w:t>: {noSalesOrder}</w:t>
-              <w:br/>
+            </w:r>
+          </w:p>
+          <w:p>
+            <w:pPr>
+              <w:spacing w:after="0" w:before="0" w:line="360" w:lineRule="auto"/>
+              <w:rPr>
+                <w:rFonts w:ascii="Arial" w:cs="Arial" w:eastAsia="Arial" w:hAnsi="Arial"/>
+                <w:sz w:val="20"/>
+                <w:szCs w:val="20"/>
+              </w:rPr>
+              <w:ind w:left="2880" w:hanging="2880"/>
+            </w:pPr>
+            <w:r>
+              <w:rPr>
+                <w:rFonts w:ascii="Arial" w:cs="Arial" w:eastAsia="Arial" w:hAnsi="Arial"/>
+                <w:sz w:val="20"/>
+                <w:szCs w:val="20"/>
+                <w:rtl w:val="0"/>
+              </w:rPr>
               <w:t xml:space="preserve">Nama Pelanggan                   </w:t>
               <w:tab/>
               <w:t>: {namaPelanggan}</w:t>

</xml_diff>